<commit_message>
Update PRI institutional status and Charter v1.1 across all locales
</commit_message>
<xml_diff>
--- a/public/forms/PRI_Research Fellow Application Form_CN-TW.docx
+++ b/public/forms/PRI_Research Fellow Application Form_CN-TW.docx
@@ -7008,6 +7008,7 @@
     <w:p>
       <w:pPr>
         <w:spacing w:after="160"/>
+        <w:keepLines w:val="1"/>
       </w:pPr>
       <w:r>
         <w:rPr>
@@ -7016,7 +7017,7 @@
           <w:color w:val="8A9196"/>
           <w:sz w:val="20"/>
         </w:rPr>
-        <w:t xml:space="preserve">3.  </w:t>
+        <w:t xml:space="preserve">3.  本人瞭解全景研究院是由全景學術集團設立的研究機構。PSG 是其上級機構及法律與行政承載主體，PRI 不具有獨立法人資格。</w:t>
       </w:r>
       <w:r>
         <w:rPr>
@@ -7024,7 +7025,7 @@
           <w:color w:val="5C6368"/>
           <w:sz w:val="20"/>
         </w:rPr>
-        <w:t>本人瞭解全景研究院是全景學術集團旗下研究與學術發展平台，並非獨立法人實體。</w:t>
+        <w:t/>
       </w:r>
     </w:p>
     <w:p>

</xml_diff>